<commit_message>
COPA MUNDO - ALTERACOES PROFUNDAS
</commit_message>
<xml_diff>
--- a/Ajuda/TUTORIA ALTERAR BANCOS DE CONEXAO.docx
+++ b/Ajuda/TUTORIA ALTERAR BANCOS DE CONEXAO.docx
@@ -5,6 +5,7 @@
     <w:p>
       <w:pPr>
         <w:rPr>
+          <w:rFonts w:ascii="Segoe UI Emoji" w:hAnsi="Segoe UI Emoji" w:cs="Segoe UI Emoji"/>
           <w:b/>
           <w:bCs/>
         </w:rPr>
@@ -15,6 +16,22 @@
           <w:b/>
           <w:bCs/>
         </w:rPr>
+        <w:t>Remove-Item Env:DATABASE_URL</w:t>
+      </w:r>
+    </w:p>
+    <w:p>
+      <w:pPr>
+        <w:rPr>
+          <w:b/>
+          <w:bCs/>
+        </w:rPr>
+      </w:pPr>
+      <w:r>
+        <w:rPr>
+          <w:rFonts w:ascii="Segoe UI Emoji" w:hAnsi="Segoe UI Emoji" w:cs="Segoe UI Emoji"/>
+          <w:b/>
+          <w:bCs/>
+        </w:rPr>
         <w:t>🧠</w:t>
       </w:r>
       <w:r>
@@ -33,7 +50,7 @@
     <w:p>
       <w:r>
         <w:pict w14:anchorId="3C978C99">
-          <v:rect id="_x0000_i1085" style="width:0;height:1.5pt" o:hralign="center" o:hrstd="t" o:hr="t" fillcolor="#a0a0a0" stroked="f"/>
+          <v:rect id="_x0000_i1025" style="width:0;height:1.5pt" o:hralign="center" o:hrstd="t" o:hr="t" fillcolor="#a0a0a0" stroked="f"/>
         </w:pict>
       </w:r>
     </w:p>
@@ -118,7 +135,7 @@
     <w:p>
       <w:r>
         <w:pict w14:anchorId="1CF9938A">
-          <v:rect id="_x0000_i1086" style="width:0;height:1.5pt" o:hralign="center" o:hrstd="t" o:hr="t" fillcolor="#a0a0a0" stroked="f"/>
+          <v:rect id="_x0000_i1026" style="width:0;height:1.5pt" o:hralign="center" o:hrstd="t" o:hr="t" fillcolor="#a0a0a0" stroked="f"/>
         </w:pict>
       </w:r>
     </w:p>
@@ -184,7 +201,7 @@
     <w:p>
       <w:r>
         <w:pict w14:anchorId="2D9DD353">
-          <v:rect id="_x0000_i1087" style="width:0;height:1.5pt" o:hralign="center" o:hrstd="t" o:hr="t" fillcolor="#a0a0a0" stroked="f"/>
+          <v:rect id="_x0000_i1027" style="width:0;height:1.5pt" o:hralign="center" o:hrstd="t" o:hr="t" fillcolor="#a0a0a0" stroked="f"/>
         </w:pict>
       </w:r>
     </w:p>
@@ -238,7 +255,7 @@
     <w:p>
       <w:r>
         <w:pict w14:anchorId="1AC0E7DA">
-          <v:rect id="_x0000_i1088" style="width:0;height:1.5pt" o:hralign="center" o:hrstd="t" o:hr="t" fillcolor="#a0a0a0" stroked="f"/>
+          <v:rect id="_x0000_i1028" style="width:0;height:1.5pt" o:hralign="center" o:hrstd="t" o:hr="t" fillcolor="#a0a0a0" stroked="f"/>
         </w:pict>
       </w:r>
     </w:p>
@@ -288,7 +305,7 @@
     <w:p>
       <w:r>
         <w:pict w14:anchorId="758B61B8">
-          <v:rect id="_x0000_i1089" style="width:0;height:1.5pt" o:hralign="center" o:hrstd="t" o:hr="t" fillcolor="#a0a0a0" stroked="f"/>
+          <v:rect id="_x0000_i1029" style="width:0;height:1.5pt" o:hralign="center" o:hrstd="t" o:hr="t" fillcolor="#a0a0a0" stroked="f"/>
         </w:pict>
       </w:r>
     </w:p>
@@ -305,6 +322,7 @@
           <w:b/>
           <w:bCs/>
         </w:rPr>
+        <w:lastRenderedPageBreak/>
         <w:t>⚠️</w:t>
       </w:r>
       <w:r>
@@ -328,7 +346,6 @@
           <w:b/>
           <w:bCs/>
         </w:rPr>
-        <w:lastRenderedPageBreak/>
         <w:t>❌</w:t>
       </w:r>
       <w:r>
@@ -375,7 +392,11 @@
     </w:p>
     <w:p>
       <w:r>
-        <w:t xml:space="preserve">$env:DATABASE_URL=  </w:t>
+        <w:t>$env:DATABASE_URL</w:t>
+      </w:r>
+      <w:proofErr w:type="gramStart"/>
+      <w:r>
+        <w:t xml:space="preserve">=  </w:t>
       </w:r>
       <w:r>
         <w:rPr>
@@ -383,6 +404,7 @@
         </w:rPr>
         <w:t>❌</w:t>
       </w:r>
+      <w:proofErr w:type="gramEnd"/>
     </w:p>
     <w:p>
       <w:pPr>
@@ -413,7 +435,11 @@
       </w:r>
       <w:r>
         <w:br/>
-        <w:t xml:space="preserve">$env:DATABASE_URL="..."  </w:t>
+        <w:t>$env:DATABASE_URL=</w:t>
+      </w:r>
+      <w:proofErr w:type="gramStart"/>
+      <w:r>
+        <w:t xml:space="preserve">"..."  </w:t>
       </w:r>
       <w:r>
         <w:rPr>
@@ -421,11 +447,12 @@
         </w:rPr>
         <w:t>❌</w:t>
       </w:r>
+      <w:proofErr w:type="gramEnd"/>
     </w:p>
     <w:p>
       <w:r>
         <w:pict w14:anchorId="7F30D3A4">
-          <v:rect id="_x0000_i1090" style="width:0;height:1.5pt" o:hralign="center" o:hrstd="t" o:hr="t" fillcolor="#a0a0a0" stroked="f"/>
+          <v:rect id="_x0000_i1030" style="width:0;height:1.5pt" o:hralign="center" o:hrstd="t" o:hr="t" fillcolor="#a0a0a0" stroked="f"/>
         </w:pict>
       </w:r>
     </w:p>
@@ -475,7 +502,7 @@
     <w:p>
       <w:r>
         <w:pict w14:anchorId="0F3427E7">
-          <v:rect id="_x0000_i1091" style="width:0;height:1.5pt" o:hralign="center" o:hrstd="t" o:hr="t" fillcolor="#a0a0a0" stroked="f"/>
+          <v:rect id="_x0000_i1031" style="width:0;height:1.5pt" o:hralign="center" o:hrstd="t" o:hr="t" fillcolor="#a0a0a0" stroked="f"/>
         </w:pict>
       </w:r>
     </w:p>
@@ -556,7 +583,7 @@
     <w:p>
       <w:r>
         <w:pict w14:anchorId="5EEB7CFE">
-          <v:rect id="_x0000_i1092" style="width:0;height:1.5pt" o:hralign="center" o:hrstd="t" o:hr="t" fillcolor="#a0a0a0" stroked="f"/>
+          <v:rect id="_x0000_i1032" style="width:0;height:1.5pt" o:hralign="center" o:hrstd="t" o:hr="t" fillcolor="#a0a0a0" stroked="f"/>
         </w:pict>
       </w:r>
     </w:p>
@@ -599,7 +626,7 @@
     <w:p>
       <w:r>
         <w:pict w14:anchorId="0B26FF55">
-          <v:rect id="_x0000_i1093" style="width:0;height:1.5pt" o:hralign="center" o:hrstd="t" o:hr="t" fillcolor="#a0a0a0" stroked="f"/>
+          <v:rect id="_x0000_i1033" style="width:0;height:1.5pt" o:hralign="center" o:hrstd="t" o:hr="t" fillcolor="#a0a0a0" stroked="f"/>
         </w:pict>
       </w:r>
     </w:p>
@@ -616,6 +643,7 @@
           <w:b/>
           <w:bCs/>
         </w:rPr>
+        <w:lastRenderedPageBreak/>
         <w:t>💥</w:t>
       </w:r>
       <w:r>
@@ -665,7 +693,6 @@
                 <w:b/>
                 <w:bCs/>
               </w:rPr>
-              <w:lastRenderedPageBreak/>
               <w:t>Quero usar</w:t>
             </w:r>
           </w:p>
@@ -784,7 +811,7 @@
     <w:p>
       <w:r>
         <w:pict w14:anchorId="721E184C">
-          <v:rect id="_x0000_i1094" style="width:0;height:1.5pt" o:hralign="center" o:hrstd="t" o:hr="t" fillcolor="#a0a0a0" stroked="f"/>
+          <v:rect id="_x0000_i1034" style="width:0;height:1.5pt" o:hralign="center" o:hrstd="t" o:hr="t" fillcolor="#a0a0a0" stroked="f"/>
         </w:pict>
       </w:r>
     </w:p>
@@ -1454,6 +1481,7 @@
   <w:style w:type="character" w:default="1" w:styleId="Fontepargpadro">
     <w:name w:val="Default Paragraph Font"/>
     <w:uiPriority w:val="1"/>
+    <w:semiHidden/>
     <w:unhideWhenUsed/>
   </w:style>
   <w:style w:type="table" w:default="1" w:styleId="Tabelanormal">

</xml_diff>